<commit_message>
metadata xp flags, ok sur JNZ
</commit_message>
<xml_diff>
--- a/renders/DC_JNZ_2026_GLOBAL_generated.docx
+++ b/renders/DC_JNZ_2026_GLOBAL_generated.docx
@@ -244,7 +244,7 @@
     </w:p>
     <w:p>
       <w:pPr>
-        <w:pStyle w:val="DCT1Sections"/>
+        <w:pStyle w:val="DC2ndbullet"/>
       </w:pPr>
       <w:r>
         <w:t>Formation des équipes</w:t>
@@ -309,13 +309,13 @@
     </w:p>
     <w:p>
       <w:pPr>
-        <w:pStyle w:val="DCT1Sections"/>
+        <w:pStyle w:val="DC3rdbullet"/>
       </w:pPr>
       <w:r>
         <w:rPr>
           <w:b/>
         </w:rPr>
-        <w:t>Transformation avec data build tool, sql, python</w:t>
+        <w:t>Transformation avec Data Build Tool, SQL, Python</w:t>
       </w:r>
     </w:p>
     <w:p>
@@ -460,7 +460,7 @@
     </w:p>
     <w:p>
       <w:pPr>
-        <w:pStyle w:val="DCT1Sections"/>
+        <w:pStyle w:val="DC3rdbullet"/>
       </w:pPr>
       <w:r>
         <w:rPr>
@@ -654,6 +654,12 @@
               <w:t>Le Wagon Bordeaux</w:t>
             </w:r>
           </w:p>
+          <w:p>
+            <w:pPr>
+              <w:pStyle w:val="DCTableContent"/>
+              <w:jc w:val="left"/>
+            </w:pPr>
+          </w:p>
         </w:tc>
       </w:tr>
       <w:tr>
@@ -700,6 +706,12 @@
             <w:r>
               <w:t>ESCEN Bordeaux</w:t>
             </w:r>
+          </w:p>
+          <w:p>
+            <w:pPr>
+              <w:pStyle w:val="DCTableContent"/>
+              <w:jc w:val="left"/>
+            </w:pPr>
           </w:p>
         </w:tc>
       </w:tr>
@@ -748,6 +760,12 @@
               <w:t>ESCEN Bordeaux</w:t>
             </w:r>
           </w:p>
+          <w:p>
+            <w:pPr>
+              <w:pStyle w:val="DCTableContent"/>
+              <w:jc w:val="left"/>
+            </w:pPr>
+          </w:p>
         </w:tc>
       </w:tr>
       <w:tr>
@@ -794,6 +812,12 @@
             <w:r>
               <w:t>IUT Bordeaux Montesquieu</w:t>
             </w:r>
+          </w:p>
+          <w:p>
+            <w:pPr>
+              <w:pStyle w:val="DCTableContent"/>
+              <w:jc w:val="left"/>
+            </w:pPr>
           </w:p>
         </w:tc>
       </w:tr>
@@ -896,22 +920,32 @@
         <w:tblW w:type="auto" w:w="0"/>
         <w:tblLayout w:type="fixed"/>
         <w:tblLook w:firstColumn="1" w:firstRow="1" w:lastColumn="0" w:lastRow="0" w:noHBand="0" w:noVBand="1" w:val="04A0"/>
+        <w:tblBorders>
+          <w:top w:val="none" w:sz="0" w:space="0" w:color="auto"/>
+          <w:left w:val="none" w:sz="0" w:space="0" w:color="auto"/>
+          <w:bottom w:val="single" w:sz="10" w:space="0" w:color="000000"/>
+          <w:right w:val="none" w:sz="0" w:space="0" w:color="auto"/>
+          <w:insideH w:val="none" w:sz="0" w:space="0" w:color="auto"/>
+          <w:insideV w:val="none" w:sz="0" w:space="0" w:color="auto"/>
+        </w:tblBorders>
       </w:tblPr>
       <w:tblGrid>
-        <w:gridCol w:w="4819"/>
-        <w:gridCol w:w="4819"/>
+        <w:gridCol w:w="6803"/>
+        <w:gridCol w:w="2835"/>
       </w:tblGrid>
       <w:tr>
         <w:trPr>
-          <w:trHeight w:val="453"/>
+          <w:trHeight w:val="360"/>
         </w:trPr>
         <w:tc>
           <w:tcPr>
-            <w:tcW w:type="dxa" w:w="4819"/>
+            <w:tcW w:type="dxa" w:w="6803"/>
+            <w:vAlign w:val="center"/>
           </w:tcPr>
           <w:p>
             <w:pPr>
               <w:pStyle w:val="DCXPTitle"/>
+              <w:jc w:val="left"/>
             </w:pPr>
             <w:r>
               <w:t>Automotive Cells Company</w:t>
@@ -920,11 +954,13 @@
         </w:tc>
         <w:tc>
           <w:tcPr>
-            <w:tcW w:type="dxa" w:w="4819"/>
+            <w:tcW w:type="dxa" w:w="2835"/>
+            <w:vAlign w:val="center"/>
           </w:tcPr>
           <w:p>
             <w:pPr>
               <w:pStyle w:val="DCXPDate"/>
+              <w:jc w:val="right"/>
             </w:pPr>
             <w:r>
               <w:rPr>
@@ -938,15 +974,17 @@
       </w:tr>
       <w:tr>
         <w:trPr>
-          <w:trHeight w:val="392"/>
+          <w:trHeight w:val="360"/>
         </w:trPr>
         <w:tc>
           <w:tcPr>
-            <w:tcW w:type="dxa" w:w="4819"/>
+            <w:tcW w:type="dxa" w:w="6803"/>
+            <w:vAlign w:val="center"/>
           </w:tcPr>
           <w:p>
             <w:pPr>
               <w:pStyle w:val="DCXPPoste"/>
+              <w:jc w:val="left"/>
             </w:pPr>
             <w:r>
               <w:rPr>
@@ -958,7 +996,8 @@
         </w:tc>
         <w:tc>
           <w:tcPr>
-            <w:tcW w:type="dxa" w:w="4819"/>
+            <w:tcW w:type="dxa" w:w="2835"/>
+            <w:vAlign w:val="center"/>
           </w:tcPr>
           <w:p/>
         </w:tc>
@@ -1224,22 +1263,32 @@
         <w:tblW w:type="auto" w:w="0"/>
         <w:tblLayout w:type="fixed"/>
         <w:tblLook w:firstColumn="1" w:firstRow="1" w:lastColumn="0" w:lastRow="0" w:noHBand="0" w:noVBand="1" w:val="04A0"/>
+        <w:tblBorders>
+          <w:top w:val="none" w:sz="0" w:space="0" w:color="auto"/>
+          <w:left w:val="none" w:sz="0" w:space="0" w:color="auto"/>
+          <w:bottom w:val="single" w:sz="10" w:space="0" w:color="000000"/>
+          <w:right w:val="none" w:sz="0" w:space="0" w:color="auto"/>
+          <w:insideH w:val="none" w:sz="0" w:space="0" w:color="auto"/>
+          <w:insideV w:val="none" w:sz="0" w:space="0" w:color="auto"/>
+        </w:tblBorders>
       </w:tblPr>
       <w:tblGrid>
-        <w:gridCol w:w="4819"/>
-        <w:gridCol w:w="4819"/>
+        <w:gridCol w:w="6803"/>
+        <w:gridCol w:w="2835"/>
       </w:tblGrid>
       <w:tr>
         <w:trPr>
-          <w:trHeight w:val="453"/>
+          <w:trHeight w:val="360"/>
         </w:trPr>
         <w:tc>
           <w:tcPr>
-            <w:tcW w:type="dxa" w:w="4819"/>
+            <w:tcW w:type="dxa" w:w="6803"/>
+            <w:vAlign w:val="center"/>
           </w:tcPr>
           <w:p>
             <w:pPr>
               <w:pStyle w:val="DCXPTitle"/>
+              <w:jc w:val="left"/>
             </w:pPr>
             <w:r>
               <w:t>Data For Good</w:t>
@@ -1248,11 +1297,13 @@
         </w:tc>
         <w:tc>
           <w:tcPr>
-            <w:tcW w:type="dxa" w:w="4819"/>
+            <w:tcW w:type="dxa" w:w="2835"/>
+            <w:vAlign w:val="center"/>
           </w:tcPr>
           <w:p>
             <w:pPr>
               <w:pStyle w:val="DCXPDate"/>
+              <w:jc w:val="right"/>
             </w:pPr>
             <w:r>
               <w:rPr>
@@ -1266,15 +1317,17 @@
       </w:tr>
       <w:tr>
         <w:trPr>
-          <w:trHeight w:val="392"/>
+          <w:trHeight w:val="360"/>
         </w:trPr>
         <w:tc>
           <w:tcPr>
-            <w:tcW w:type="dxa" w:w="4819"/>
+            <w:tcW w:type="dxa" w:w="6803"/>
+            <w:vAlign w:val="center"/>
           </w:tcPr>
           <w:p>
             <w:pPr>
               <w:pStyle w:val="DCXPPoste"/>
+              <w:jc w:val="left"/>
             </w:pPr>
             <w:r>
               <w:rPr>
@@ -1286,7 +1339,8 @@
         </w:tc>
         <w:tc>
           <w:tcPr>
-            <w:tcW w:type="dxa" w:w="4819"/>
+            <w:tcW w:type="dxa" w:w="2835"/>
+            <w:vAlign w:val="center"/>
           </w:tcPr>
           <w:p/>
         </w:tc>
@@ -1569,22 +1623,32 @@
         <w:tblW w:type="auto" w:w="0"/>
         <w:tblLayout w:type="fixed"/>
         <w:tblLook w:firstColumn="1" w:firstRow="1" w:lastColumn="0" w:lastRow="0" w:noHBand="0" w:noVBand="1" w:val="04A0"/>
+        <w:tblBorders>
+          <w:top w:val="none" w:sz="0" w:space="0" w:color="auto"/>
+          <w:left w:val="none" w:sz="0" w:space="0" w:color="auto"/>
+          <w:bottom w:val="single" w:sz="10" w:space="0" w:color="000000"/>
+          <w:right w:val="none" w:sz="0" w:space="0" w:color="auto"/>
+          <w:insideH w:val="none" w:sz="0" w:space="0" w:color="auto"/>
+          <w:insideV w:val="none" w:sz="0" w:space="0" w:color="auto"/>
+        </w:tblBorders>
       </w:tblPr>
       <w:tblGrid>
-        <w:gridCol w:w="4819"/>
-        <w:gridCol w:w="4819"/>
+        <w:gridCol w:w="6803"/>
+        <w:gridCol w:w="2835"/>
       </w:tblGrid>
       <w:tr>
         <w:trPr>
-          <w:trHeight w:val="453"/>
+          <w:trHeight w:val="360"/>
         </w:trPr>
         <w:tc>
           <w:tcPr>
-            <w:tcW w:type="dxa" w:w="4819"/>
+            <w:tcW w:type="dxa" w:w="6803"/>
+            <w:vAlign w:val="center"/>
           </w:tcPr>
           <w:p>
             <w:pPr>
               <w:pStyle w:val="DCXPTitle"/>
+              <w:jc w:val="left"/>
             </w:pPr>
             <w:r>
               <w:t>KEYOR, Bordeaux</w:t>
@@ -1593,11 +1657,13 @@
         </w:tc>
         <w:tc>
           <w:tcPr>
-            <w:tcW w:type="dxa" w:w="4819"/>
+            <w:tcW w:type="dxa" w:w="2835"/>
+            <w:vAlign w:val="center"/>
           </w:tcPr>
           <w:p>
             <w:pPr>
               <w:pStyle w:val="DCXPDate"/>
+              <w:jc w:val="right"/>
             </w:pPr>
             <w:r>
               <w:rPr>
@@ -1611,15 +1677,17 @@
       </w:tr>
       <w:tr>
         <w:trPr>
-          <w:trHeight w:val="390"/>
+          <w:trHeight w:val="360"/>
         </w:trPr>
         <w:tc>
           <w:tcPr>
-            <w:tcW w:type="dxa" w:w="4819"/>
+            <w:tcW w:type="dxa" w:w="6803"/>
+            <w:vAlign w:val="center"/>
           </w:tcPr>
           <w:p>
             <w:pPr>
               <w:pStyle w:val="DCXPPoste"/>
+              <w:jc w:val="left"/>
             </w:pPr>
             <w:r>
               <w:rPr>
@@ -1631,7 +1699,8 @@
         </w:tc>
         <w:tc>
           <w:tcPr>
-            <w:tcW w:type="dxa" w:w="4819"/>
+            <w:tcW w:type="dxa" w:w="2835"/>
+            <w:vAlign w:val="center"/>
           </w:tcPr>
           <w:p/>
         </w:tc>
@@ -2025,22 +2094,32 @@
         <w:tblW w:type="auto" w:w="0"/>
         <w:tblLayout w:type="fixed"/>
         <w:tblLook w:firstColumn="1" w:firstRow="1" w:lastColumn="0" w:lastRow="0" w:noHBand="0" w:noVBand="1" w:val="04A0"/>
+        <w:tblBorders>
+          <w:top w:val="none" w:sz="0" w:space="0" w:color="auto"/>
+          <w:left w:val="none" w:sz="0" w:space="0" w:color="auto"/>
+          <w:bottom w:val="single" w:sz="10" w:space="0" w:color="000000"/>
+          <w:right w:val="none" w:sz="0" w:space="0" w:color="auto"/>
+          <w:insideH w:val="none" w:sz="0" w:space="0" w:color="auto"/>
+          <w:insideV w:val="none" w:sz="0" w:space="0" w:color="auto"/>
+        </w:tblBorders>
       </w:tblPr>
       <w:tblGrid>
-        <w:gridCol w:w="4819"/>
-        <w:gridCol w:w="4819"/>
+        <w:gridCol w:w="6803"/>
+        <w:gridCol w:w="2835"/>
       </w:tblGrid>
       <w:tr>
         <w:trPr>
-          <w:trHeight w:val="453"/>
+          <w:trHeight w:val="360"/>
         </w:trPr>
         <w:tc>
           <w:tcPr>
-            <w:tcW w:type="dxa" w:w="4819"/>
+            <w:tcW w:type="dxa" w:w="6803"/>
+            <w:vAlign w:val="center"/>
           </w:tcPr>
           <w:p>
             <w:pPr>
               <w:pStyle w:val="DCXPTitle"/>
+              <w:jc w:val="left"/>
             </w:pPr>
             <w:r>
               <w:t>Vignobles Bardet, Vignonet</w:t>
@@ -2049,11 +2128,13 @@
         </w:tc>
         <w:tc>
           <w:tcPr>
-            <w:tcW w:type="dxa" w:w="4819"/>
+            <w:tcW w:type="dxa" w:w="2835"/>
+            <w:vAlign w:val="center"/>
           </w:tcPr>
           <w:p>
             <w:pPr>
               <w:pStyle w:val="DCXPDate"/>
+              <w:jc w:val="right"/>
             </w:pPr>
             <w:r>
               <w:rPr>
@@ -2067,15 +2148,17 @@
       </w:tr>
       <w:tr>
         <w:trPr>
-          <w:trHeight w:val="401"/>
+          <w:trHeight w:val="360"/>
         </w:trPr>
         <w:tc>
           <w:tcPr>
-            <w:tcW w:type="dxa" w:w="4819"/>
+            <w:tcW w:type="dxa" w:w="6803"/>
+            <w:vAlign w:val="center"/>
           </w:tcPr>
           <w:p>
             <w:pPr>
               <w:pStyle w:val="DCXPPoste"/>
+              <w:jc w:val="left"/>
             </w:pPr>
             <w:r>
               <w:rPr>
@@ -2087,7 +2170,8 @@
         </w:tc>
         <w:tc>
           <w:tcPr>
-            <w:tcW w:type="dxa" w:w="4819"/>
+            <w:tcW w:type="dxa" w:w="2835"/>
+            <w:vAlign w:val="center"/>
           </w:tcPr>
           <w:p/>
         </w:tc>
@@ -2191,22 +2275,32 @@
         <w:tblW w:type="auto" w:w="0"/>
         <w:tblLayout w:type="fixed"/>
         <w:tblLook w:firstColumn="1" w:firstRow="1" w:lastColumn="0" w:lastRow="0" w:noHBand="0" w:noVBand="1" w:val="04A0"/>
+        <w:tblBorders>
+          <w:top w:val="none" w:sz="0" w:space="0" w:color="auto"/>
+          <w:left w:val="none" w:sz="0" w:space="0" w:color="auto"/>
+          <w:bottom w:val="single" w:sz="10" w:space="0" w:color="000000"/>
+          <w:right w:val="none" w:sz="0" w:space="0" w:color="auto"/>
+          <w:insideH w:val="none" w:sz="0" w:space="0" w:color="auto"/>
+          <w:insideV w:val="none" w:sz="0" w:space="0" w:color="auto"/>
+        </w:tblBorders>
       </w:tblPr>
       <w:tblGrid>
-        <w:gridCol w:w="4819"/>
-        <w:gridCol w:w="4819"/>
+        <w:gridCol w:w="6803"/>
+        <w:gridCol w:w="2835"/>
       </w:tblGrid>
       <w:tr>
         <w:trPr>
-          <w:trHeight w:val="453"/>
+          <w:trHeight w:val="360"/>
         </w:trPr>
         <w:tc>
           <w:tcPr>
-            <w:tcW w:type="dxa" w:w="4819"/>
+            <w:tcW w:type="dxa" w:w="6803"/>
+            <w:vAlign w:val="center"/>
           </w:tcPr>
           <w:p>
             <w:pPr>
               <w:pStyle w:val="DCXPTitle"/>
+              <w:jc w:val="left"/>
             </w:pPr>
             <w:r>
               <w:t>Actiplay (Klarsen), Bordeaux</w:t>
@@ -2215,11 +2309,13 @@
         </w:tc>
         <w:tc>
           <w:tcPr>
-            <w:tcW w:type="dxa" w:w="4819"/>
+            <w:tcW w:type="dxa" w:w="2835"/>
+            <w:vAlign w:val="center"/>
           </w:tcPr>
           <w:p>
             <w:pPr>
               <w:pStyle w:val="DCXPDate"/>
+              <w:jc w:val="right"/>
             </w:pPr>
             <w:r>
               <w:rPr>
@@ -2233,15 +2329,17 @@
       </w:tr>
       <w:tr>
         <w:trPr>
-          <w:trHeight w:val="394"/>
+          <w:trHeight w:val="360"/>
         </w:trPr>
         <w:tc>
           <w:tcPr>
-            <w:tcW w:type="dxa" w:w="4819"/>
+            <w:tcW w:type="dxa" w:w="6803"/>
+            <w:vAlign w:val="center"/>
           </w:tcPr>
           <w:p>
             <w:pPr>
               <w:pStyle w:val="DCXPPoste"/>
+              <w:jc w:val="left"/>
             </w:pPr>
             <w:r>
               <w:rPr>
@@ -2253,7 +2351,8 @@
         </w:tc>
         <w:tc>
           <w:tcPr>
-            <w:tcW w:type="dxa" w:w="4819"/>
+            <w:tcW w:type="dxa" w:w="2835"/>
+            <w:vAlign w:val="center"/>
           </w:tcPr>
           <w:p/>
         </w:tc>

</xml_diff>